<commit_message>
Feasibility template: match the searches it ranks for, add a PDF, download first
Search Console (last 3 months) shows the questionnaire/template searches at
positions 7-11 with ~1,600 impressions and no clicks, and the site-feasibility
guide drawing more impressions than the template for them.

- Template title, description and H1 now match the top searches ("clinical
  trial site feasibility questionnaire template") and say free, Word or PDF.
- Hero's main button downloads the Word file, as on the SMS templates page.
- New printable PDF (exported from the regenerated Word file) with its own
  download block; Word file regenerated for the new H1.
- Guide links to the template with matching anchor text in the questionnaire
  step.

Co-Authored-By: Claude Opus 5.5 (1M context) <noreply@anthropic.com>
</commit_message>
<xml_diff>
--- a/public/downloads/feasibility-questionnaire.docx
+++ b/public/downloads/feasibility-questionnaire.docx
@@ -7,7 +7,7 @@
         <w:pStyle w:val="Title"/>
       </w:pPr>
       <w:r>
-        <w:t xml:space="preserve">Feasibility questionnaire template for research sites</w:t>
+        <w:t xml:space="preserve">Clinical trial site feasibility questionnaire template</w:t>
       </w:r>
     </w:p>
     <w:p>
@@ -20,7 +20,7 @@
           <w:sz w:val="18"/>
           <w:szCs w:val="18"/>
         </w:rPr>
-        <w:t xml:space="preserve">Bond Health template · bondtrials.com/templates/feasibility-questionnaire · Last updated 2026-10-23</w:t>
+        <w:t xml:space="preserve">Bond Health template · bondtrials.com/templates/feasibility-questionnaire · Last updated 2026-10-25</w:t>
       </w:r>
     </w:p>
     <w:p>

</xml_diff>